<commit_message>
Se organiza carpetas de git del curso
</commit_message>
<xml_diff>
--- a/Clases/Calendario de Exposiciones y Proyectos.docx
+++ b/Clases/Calendario de Exposiciones y Proyectos.docx
@@ -1279,8 +1279,30 @@
               <w:rPr>
                 <w:sz w:val="16"/>
               </w:rPr>
-              <w:t>Aaron/Jesus/Angel</w:t>
-            </w:r>
+              <w:t>Aaron/</w:t>
+            </w:r>
+            <w:proofErr w:type="spellStart"/>
+            <w:r>
+              <w:rPr>
+                <w:sz w:val="16"/>
+              </w:rPr>
+              <w:t>Jesus</w:t>
+            </w:r>
+            <w:proofErr w:type="spellEnd"/>
+            <w:r>
+              <w:rPr>
+                <w:sz w:val="16"/>
+              </w:rPr>
+              <w:t>/</w:t>
+            </w:r>
+            <w:proofErr w:type="spellStart"/>
+            <w:r>
+              <w:rPr>
+                <w:sz w:val="16"/>
+              </w:rPr>
+              <w:t>Angel</w:t>
+            </w:r>
+            <w:proofErr w:type="spellEnd"/>
             <w:r>
               <w:rPr>
                 <w:sz w:val="16"/>
@@ -2080,8 +2102,16 @@
               <w:rPr>
                 <w:sz w:val="16"/>
               </w:rPr>
-              <w:t>/Andres</w:t>
-            </w:r>
+              <w:t>/</w:t>
+            </w:r>
+            <w:proofErr w:type="spellStart"/>
+            <w:r>
+              <w:rPr>
+                <w:sz w:val="16"/>
+              </w:rPr>
+              <w:t>Andres</w:t>
+            </w:r>
+            <w:proofErr w:type="spellEnd"/>
           </w:p>
           <w:p>
             <w:pPr>
@@ -2273,6 +2303,12 @@
                 <w:sz w:val="16"/>
               </w:rPr>
               <w:t>Miguel Carballo</w:t>
+            </w:r>
+            <w:r>
+              <w:rPr>
+                <w:sz w:val="16"/>
+              </w:rPr>
+              <w:t>/Daryl</w:t>
             </w:r>
           </w:p>
         </w:tc>

</xml_diff>